<commit_message>
Add favicon to all pages and include software specification document
</commit_message>
<xml_diff>
--- a/SOFTWARE REQUIREMENTS SPECIFICATION  FOR RABS.docx
+++ b/SOFTWARE REQUIREMENTS SPECIFICATION  FOR RABS.docx
@@ -4,6 +4,7 @@
   <w:body>
     <w:p>
       <w:pPr>
+        <w:jc w:val="both"/>
         <w:rPr>
           <w:b/>
           <w:bCs/>
@@ -18,6 +19,9 @@
       </w:r>
     </w:p>
     <w:p>
+      <w:pPr>
+        <w:jc w:val="both"/>
+      </w:pPr>
       <w:r>
         <w:rPr>
           <w:b/>
@@ -30,6 +34,9 @@
       </w:r>
     </w:p>
     <w:p>
+      <w:pPr>
+        <w:jc w:val="both"/>
+      </w:pPr>
       <w:r>
         <w:rPr>
           <w:b/>
@@ -38,12 +45,29 @@
         <w:t>Date:</w:t>
       </w:r>
       <w:r>
-        <w:t xml:space="preserve"> January 20, 2026</w:t>
-      </w:r>
-    </w:p>
-    <w:p/>
-    <w:p>
-      <w:pPr>
+        <w:t xml:space="preserve"> </w:t>
+      </w:r>
+      <w:r>
+        <w:t>MARCH</w:t>
+      </w:r>
+      <w:r>
+        <w:t xml:space="preserve"> 20</w:t>
+      </w:r>
+      <w:r>
+        <w:t>th</w:t>
+      </w:r>
+      <w:r>
+        <w:t>, 2026</w:t>
+      </w:r>
+    </w:p>
+    <w:p>
+      <w:pPr>
+        <w:jc w:val="both"/>
+      </w:pPr>
+    </w:p>
+    <w:p>
+      <w:pPr>
+        <w:jc w:val="both"/>
         <w:rPr>
           <w:b/>
           <w:bCs/>
@@ -58,6 +82,9 @@
       </w:r>
     </w:p>
     <w:p>
+      <w:pPr>
+        <w:jc w:val="both"/>
+      </w:pPr>
       <w:r>
         <w:t xml:space="preserve">The Result Checker Web App is a portal designed to automate </w:t>
       </w:r>
@@ -68,9 +95,14 @@
         <w:t>. It replaces manual paper-based result sharing with a digital system that allows administrators to register students, teachers to upload scores, and students to view their performance through a simplified dashboard.</w:t>
       </w:r>
     </w:p>
-    <w:p/>
-    <w:p>
-      <w:pPr>
+    <w:p>
+      <w:pPr>
+        <w:jc w:val="both"/>
+      </w:pPr>
+    </w:p>
+    <w:p>
+      <w:pPr>
+        <w:jc w:val="both"/>
         <w:rPr>
           <w:b/>
           <w:bCs/>
@@ -86,6 +118,7 @@
     </w:p>
     <w:p>
       <w:pPr>
+        <w:jc w:val="both"/>
         <w:rPr>
           <w:b/>
           <w:bCs/>
@@ -105,6 +138,7 @@
           <w:ilvl w:val="0"/>
           <w:numId w:val="10"/>
         </w:numPr>
+        <w:jc w:val="both"/>
       </w:pPr>
       <w:r>
         <w:rPr>
@@ -115,6 +149,9 @@
       </w:r>
       <w:r>
         <w:t xml:space="preserve"> Access is granted using </w:t>
+      </w:r>
+      <w:r>
+        <w:t xml:space="preserve">the </w:t>
       </w:r>
       <w:r>
         <w:rPr>
@@ -133,6 +170,7 @@
           <w:ilvl w:val="0"/>
           <w:numId w:val="10"/>
         </w:numPr>
+        <w:jc w:val="both"/>
       </w:pPr>
       <w:r>
         <w:rPr>
@@ -147,24 +185,7 @@
     </w:p>
     <w:p>
       <w:pPr>
-        <w:numPr>
-          <w:ilvl w:val="0"/>
-          <w:numId w:val="10"/>
-        </w:numPr>
-      </w:pPr>
-      <w:r>
-        <w:rPr>
-          <w:b/>
-          <w:bCs/>
-        </w:rPr>
-        <w:t>Permissions:</w:t>
-      </w:r>
-      <w:r>
-        <w:t xml:space="preserve"> View-only access to academic results and school announcements.</w:t>
-      </w:r>
-    </w:p>
-    <w:p>
-      <w:pPr>
+        <w:jc w:val="both"/>
         <w:rPr>
           <w:b/>
           <w:bCs/>
@@ -184,6 +205,7 @@
           <w:ilvl w:val="0"/>
           <w:numId w:val="11"/>
         </w:numPr>
+        <w:jc w:val="both"/>
       </w:pPr>
       <w:r>
         <w:rPr>
@@ -212,6 +234,7 @@
           <w:ilvl w:val="0"/>
           <w:numId w:val="11"/>
         </w:numPr>
+        <w:jc w:val="both"/>
       </w:pPr>
       <w:r>
         <w:rPr>
@@ -226,6 +249,7 @@
     </w:p>
     <w:p>
       <w:pPr>
+        <w:jc w:val="both"/>
         <w:rPr>
           <w:b/>
           <w:bCs/>
@@ -245,6 +269,7 @@
           <w:ilvl w:val="0"/>
           <w:numId w:val="12"/>
         </w:numPr>
+        <w:jc w:val="both"/>
       </w:pPr>
       <w:r>
         <w:rPr>
@@ -273,6 +298,7 @@
           <w:ilvl w:val="0"/>
           <w:numId w:val="12"/>
         </w:numPr>
+        <w:jc w:val="both"/>
       </w:pPr>
       <w:r>
         <w:rPr>
@@ -285,9 +311,14 @@
         <w:t xml:space="preserve"> Full system management, including student/teacher registration, class creation, and subject management.</w:t>
       </w:r>
     </w:p>
-    <w:p/>
-    <w:p>
-      <w:pPr>
+    <w:p>
+      <w:pPr>
+        <w:jc w:val="both"/>
+      </w:pPr>
+    </w:p>
+    <w:p>
+      <w:pPr>
+        <w:jc w:val="both"/>
         <w:rPr>
           <w:b/>
           <w:bCs/>
@@ -303,6 +334,7 @@
     </w:p>
     <w:p>
       <w:pPr>
+        <w:jc w:val="both"/>
         <w:rPr>
           <w:b/>
           <w:bCs/>
@@ -322,6 +354,7 @@
           <w:ilvl w:val="0"/>
           <w:numId w:val="13"/>
         </w:numPr>
+        <w:jc w:val="both"/>
       </w:pPr>
       <w:r>
         <w:rPr>
@@ -331,7 +364,16 @@
         <w:t>Student Registration:</w:t>
       </w:r>
       <w:r>
-        <w:t xml:space="preserve"> Admins enter student details (Name, DOB, Class) to generate a unique ID.</w:t>
+        <w:t xml:space="preserve"> </w:t>
+      </w:r>
+      <w:r>
+        <w:t xml:space="preserve">Students will be registered by their form teacher to generate a Unique ID using details such </w:t>
+      </w:r>
+      <w:r>
+        <w:t>as</w:t>
+      </w:r>
+      <w:r>
+        <w:t xml:space="preserve">: FULL NAME, CLASS, DATE OF BIRTH </w:t>
       </w:r>
     </w:p>
     <w:p>
@@ -340,13 +382,13 @@
           <w:ilvl w:val="0"/>
           <w:numId w:val="13"/>
         </w:numPr>
-      </w:pPr>
-      <w:r>
-        <w:rPr>
-          <w:b/>
-          <w:bCs/>
-        </w:rPr>
-        <w:lastRenderedPageBreak/>
+        <w:jc w:val="both"/>
+      </w:pPr>
+      <w:r>
+        <w:rPr>
+          <w:b/>
+          <w:bCs/>
+        </w:rPr>
         <w:t>Staff Management:</w:t>
       </w:r>
       <w:r>
@@ -359,12 +401,14 @@
           <w:ilvl w:val="0"/>
           <w:numId w:val="13"/>
         </w:numPr>
-      </w:pPr>
-      <w:r>
-        <w:rPr>
-          <w:b/>
-          <w:bCs/>
-        </w:rPr>
+        <w:jc w:val="both"/>
+      </w:pPr>
+      <w:r>
+        <w:rPr>
+          <w:b/>
+          <w:bCs/>
+        </w:rPr>
+        <w:lastRenderedPageBreak/>
         <w:t>Database Management:</w:t>
       </w:r>
       <w:r>
@@ -373,6 +417,7 @@
     </w:p>
     <w:p>
       <w:pPr>
+        <w:jc w:val="both"/>
         <w:rPr>
           <w:b/>
           <w:bCs/>
@@ -392,6 +437,7 @@
           <w:ilvl w:val="0"/>
           <w:numId w:val="14"/>
         </w:numPr>
+        <w:jc w:val="both"/>
       </w:pPr>
       <w:r>
         <w:rPr>
@@ -410,6 +456,7 @@
           <w:ilvl w:val="0"/>
           <w:numId w:val="14"/>
         </w:numPr>
+        <w:jc w:val="both"/>
       </w:pPr>
       <w:r>
         <w:rPr>
@@ -424,6 +471,26 @@
     </w:p>
     <w:p>
       <w:pPr>
+        <w:numPr>
+          <w:ilvl w:val="0"/>
+          <w:numId w:val="14"/>
+        </w:numPr>
+        <w:jc w:val="both"/>
+      </w:pPr>
+      <w:r>
+        <w:rPr>
+          <w:b/>
+          <w:bCs/>
+        </w:rPr>
+        <w:t>Result Retrieval:</w:t>
+      </w:r>
+      <w:r>
+        <w:t xml:space="preserve"> Results can also be retrieved from the database</w:t>
+      </w:r>
+    </w:p>
+    <w:p>
+      <w:pPr>
+        <w:jc w:val="both"/>
         <w:rPr>
           <w:b/>
           <w:bCs/>
@@ -443,6 +510,7 @@
           <w:ilvl w:val="0"/>
           <w:numId w:val="15"/>
         </w:numPr>
+        <w:jc w:val="both"/>
       </w:pPr>
       <w:r>
         <w:rPr>
@@ -461,6 +529,7 @@
           <w:ilvl w:val="0"/>
           <w:numId w:val="15"/>
         </w:numPr>
+        <w:jc w:val="both"/>
       </w:pPr>
       <w:r>
         <w:rPr>
@@ -479,6 +548,7 @@
           <w:ilvl w:val="0"/>
           <w:numId w:val="15"/>
         </w:numPr>
+        <w:jc w:val="both"/>
       </w:pPr>
       <w:r>
         <w:rPr>
@@ -491,9 +561,14 @@
         <w:t xml:space="preserve"> A section for upcoming term dates and school news.</w:t>
       </w:r>
     </w:p>
-    <w:p/>
-    <w:p>
-      <w:pPr>
+    <w:p>
+      <w:pPr>
+        <w:jc w:val="both"/>
+      </w:pPr>
+    </w:p>
+    <w:p>
+      <w:pPr>
+        <w:jc w:val="both"/>
         <w:rPr>
           <w:b/>
           <w:bCs/>
@@ -509,6 +584,7 @@
     </w:p>
     <w:p>
       <w:pPr>
+        <w:jc w:val="both"/>
         <w:rPr>
           <w:b/>
           <w:bCs/>
@@ -528,6 +604,7 @@
           <w:ilvl w:val="0"/>
           <w:numId w:val="16"/>
         </w:numPr>
+        <w:jc w:val="both"/>
       </w:pPr>
       <w:r>
         <w:rPr>
@@ -546,6 +623,7 @@
           <w:ilvl w:val="0"/>
           <w:numId w:val="16"/>
         </w:numPr>
+        <w:jc w:val="both"/>
       </w:pPr>
       <w:r>
         <w:rPr>
@@ -574,6 +652,7 @@
           <w:ilvl w:val="0"/>
           <w:numId w:val="16"/>
         </w:numPr>
+        <w:jc w:val="both"/>
       </w:pPr>
       <w:r>
         <w:rPr>
@@ -592,6 +671,7 @@
           <w:ilvl w:val="0"/>
           <w:numId w:val="16"/>
         </w:numPr>
+        <w:jc w:val="both"/>
       </w:pPr>
       <w:r>
         <w:rPr>
@@ -620,6 +700,7 @@
           <w:ilvl w:val="1"/>
           <w:numId w:val="16"/>
         </w:numPr>
+        <w:jc w:val="both"/>
       </w:pPr>
       <w:r>
         <w:rPr>
@@ -638,6 +719,7 @@
           <w:ilvl w:val="0"/>
           <w:numId w:val="16"/>
         </w:numPr>
+        <w:jc w:val="both"/>
       </w:pPr>
       <w:r>
         <w:rPr>
@@ -662,6 +744,7 @@
     </w:p>
     <w:p>
       <w:pPr>
+        <w:jc w:val="both"/>
         <w:rPr>
           <w:b/>
           <w:bCs/>
@@ -681,6 +764,7 @@
           <w:ilvl w:val="0"/>
           <w:numId w:val="17"/>
         </w:numPr>
+        <w:jc w:val="both"/>
       </w:pPr>
       <w:r>
         <w:rPr>
@@ -699,6 +783,7 @@
           <w:ilvl w:val="0"/>
           <w:numId w:val="17"/>
         </w:numPr>
+        <w:jc w:val="both"/>
       </w:pPr>
       <w:r>
         <w:rPr>
@@ -727,6 +812,7 @@
           <w:ilvl w:val="0"/>
           <w:numId w:val="17"/>
         </w:numPr>
+        <w:jc w:val="both"/>
       </w:pPr>
       <w:r>
         <w:rPr>
@@ -745,6 +831,7 @@
           <w:ilvl w:val="0"/>
           <w:numId w:val="17"/>
         </w:numPr>
+        <w:jc w:val="both"/>
       </w:pPr>
       <w:r>
         <w:rPr>
@@ -757,21 +844,34 @@
         <w:t xml:space="preserve"> Staff performs administrative tasks or uploads scores.</w:t>
       </w:r>
     </w:p>
-    <w:p/>
-    <w:p/>
-    <w:p>
-      <w:pPr>
-        <w:rPr>
-          <w:b/>
-          <w:bCs/>
-        </w:rPr>
-      </w:pPr>
-      <w:r>
-        <w:rPr>
-          <w:b/>
-          <w:bCs/>
-        </w:rPr>
-        <w:lastRenderedPageBreak/>
+    <w:p>
+      <w:pPr>
+        <w:jc w:val="both"/>
+      </w:pPr>
+    </w:p>
+    <w:p>
+      <w:pPr>
+        <w:jc w:val="both"/>
+      </w:pPr>
+    </w:p>
+    <w:p>
+      <w:pPr>
+        <w:jc w:val="both"/>
+      </w:pPr>
+    </w:p>
+    <w:p>
+      <w:pPr>
+        <w:jc w:val="both"/>
+        <w:rPr>
+          <w:b/>
+          <w:bCs/>
+        </w:rPr>
+      </w:pPr>
+      <w:r>
+        <w:rPr>
+          <w:b/>
+          <w:bCs/>
+        </w:rPr>
         <w:t>5. Technical Specifications</w:t>
       </w:r>
     </w:p>
@@ -781,6 +881,7 @@
           <w:ilvl w:val="0"/>
           <w:numId w:val="18"/>
         </w:numPr>
+        <w:jc w:val="both"/>
       </w:pPr>
       <w:r>
         <w:rPr>
@@ -790,7 +891,13 @@
         <w:t>Frontend:</w:t>
       </w:r>
       <w:r>
-        <w:t xml:space="preserve"> React (for the user interface and portal sections).</w:t>
+        <w:t xml:space="preserve"> </w:t>
+      </w:r>
+      <w:r>
+        <w:t xml:space="preserve">HTML AND CSS </w:t>
+      </w:r>
+      <w:r>
+        <w:t xml:space="preserve"> (for the user interface and portal sections).</w:t>
       </w:r>
     </w:p>
     <w:p>
@@ -799,6 +906,7 @@
           <w:ilvl w:val="0"/>
           <w:numId w:val="18"/>
         </w:numPr>
+        <w:jc w:val="both"/>
       </w:pPr>
       <w:r>
         <w:rPr>
@@ -817,6 +925,7 @@
           <w:ilvl w:val="0"/>
           <w:numId w:val="18"/>
         </w:numPr>
+        <w:jc w:val="both"/>
       </w:pPr>
       <w:r>
         <w:rPr>
@@ -826,7 +935,7 @@
         <w:t>Database:</w:t>
       </w:r>
       <w:r>
-        <w:t xml:space="preserve"> Structured Database (PostgreSQL/MySQL) for relational student and result data.</w:t>
+        <w:t xml:space="preserve"> Structured Database (MySQL) for relational student and result data.</w:t>
       </w:r>
     </w:p>
     <w:p>
@@ -835,6 +944,7 @@
           <w:ilvl w:val="0"/>
           <w:numId w:val="18"/>
         </w:numPr>
+        <w:jc w:val="both"/>
       </w:pPr>
       <w:r>
         <w:rPr>
@@ -844,10 +954,20 @@
         <w:t>Infrastructure:</w:t>
       </w:r>
       <w:r>
-        <w:t xml:space="preserve"> Planned hosting on Microsoft Azure (App Service/SQL Database).</w:t>
-      </w:r>
-    </w:p>
-    <w:p/>
+        <w:t xml:space="preserve"> Planned hosting on</w:t>
+      </w:r>
+      <w:r>
+        <w:t xml:space="preserve"> Render </w:t>
+      </w:r>
+      <w:r>
+        <w:t>(App Service/SQL Database).</w:t>
+      </w:r>
+    </w:p>
+    <w:p>
+      <w:pPr>
+        <w:jc w:val="both"/>
+      </w:pPr>
+    </w:p>
     <w:sectPr>
       <w:pgSz w:w="12240" w:h="15840"/>
       <w:pgMar w:top="1440" w:right="1440" w:bottom="1440" w:left="1440" w:header="720" w:footer="720" w:gutter="0"/>
@@ -4066,6 +4186,7 @@
   <w:style w:type="character" w:default="1" w:styleId="DefaultParagraphFont">
     <w:name w:val="Default Paragraph Font"/>
     <w:uiPriority w:val="1"/>
+    <w:semiHidden/>
     <w:unhideWhenUsed/>
   </w:style>
   <w:style w:type="table" w:default="1" w:styleId="TableNormal">

</xml_diff>